<commit_message>
fix(templates): change academic department signature wrapping to inline in vacant paragraph
</commit_message>
<xml_diff>
--- a/addons-extra/extrairg/irg_gradebook_certificates/static/src/templates/Plantilla-certificado-asistencia-dpto.docx
+++ b/addons-extra/extrairg/irg_gradebook_certificates/static/src/templates/Plantilla-certificado-asistencia-dpto.docx
@@ -355,92 +355,6 @@
           <w:sz w:val="20"/>
           <w:szCs w:val="20"/>
         </w:rPr>
-      </w:r>
-      <w:r>
-        <mc:AlternateContent>
-          <mc:Choice Requires="wpg">
-            <w:drawing>
-              <wp:anchor xmlns:wp="http://schemas.openxmlformats.org/drawingml/2006/wordprocessingDrawing" xmlns:wp14="http://schemas.microsoft.com/office/word/2010/wordprocessingDrawing" distT="0" distB="0" distL="114300" distR="114300" simplePos="0" relativeHeight="251658240" behindDoc="1" locked="0" layoutInCell="1" allowOverlap="1">
-                <wp:simplePos x="0" y="0"/>
-                <wp:positionH relativeFrom="margin">
-                  <wp:posOffset>0</wp:posOffset>
-                </wp:positionH>
-                <wp:positionV relativeFrom="paragraph">
-                  <wp:posOffset>155371</wp:posOffset>
-                </wp:positionV>
-                <wp:extent cx="1357525" cy="595705"/>
-                <wp:effectExtent l="0" t="0" r="0" b="0"/>
-                <wp:wrapTight wrapText="bothSides">
-                  <wp:wrapPolygon edited="1">
-                    <wp:start x="0" y="0"/>
-                    <wp:lineTo x="0" y="21368"/>
-                    <wp:lineTo x="21403" y="21368"/>
-                    <wp:lineTo x="21403" y="0"/>
-                    <wp:lineTo x="0" y="0"/>
-                  </wp:wrapPolygon>
-                </wp:wrapTight>
-                <wp:docPr id="2" name="Imagen 1"/>
-                <wp:cNvGraphicFramePr>
-                  <a:graphicFrameLocks xmlns:a="http://schemas.openxmlformats.org/drawingml/2006/main" noChangeAspect="1"/>
-                </wp:cNvGraphicFramePr>
-                <a:graphic xmlns:a="http://schemas.openxmlformats.org/drawingml/2006/main">
-                  <a:graphicData uri="http://schemas.openxmlformats.org/drawingml/2006/picture">
-                    <pic:pic xmlns:pic="http://schemas.openxmlformats.org/drawingml/2006/picture">
-                      <pic:nvPicPr>
-                        <pic:cNvPr id="25143027" name=""/>
-                        <pic:cNvPicPr>
-                          <a:picLocks noChangeAspect="1"/>
-                        </pic:cNvPicPr>
-                        <pic:nvPr/>
-                      </pic:nvPicPr>
-                      <pic:blipFill rotWithShape="1">
-                        <a:blip r:embed="rId9"/>
-                        <a:stretch/>
-                      </pic:blipFill>
-                      <pic:spPr bwMode="auto">
-                        <a:xfrm flipH="0" flipV="0">
-                          <a:off x="0" y="0"/>
-                          <a:ext cx="1357525" cy="595705"/>
-                        </a:xfrm>
-                        <a:prstGeom prst="rect">
-                          <a:avLst/>
-                        </a:prstGeom>
-                      </pic:spPr>
-                    </pic:pic>
-                  </a:graphicData>
-                </a:graphic>
-              </wp:anchor>
-            </w:drawing>
-          </mc:Choice>
-          <mc:Fallback>
-            <w:pict>
-              <v:shapetype id="_x0000_t75" coordsize="21600,21600" o:spt="75" o:preferrelative="t" path="m@4@5l@4@11@9@11@9@5xe" filled="f" stroked="f">
-                <v:stroke joinstyle="miter"/>
-                <v:formulas>
-                  <v:f eqn="if lineDrawn pixelLineWidth 0"/>
-                  <v:f eqn="sum @0 1 0"/>
-                  <v:f eqn="sum 0 0 @1"/>
-                  <v:f eqn="prod @2 1 2"/>
-                  <v:f eqn="prod @3 21600 pixelWidth"/>
-                  <v:f eqn="prod @3 21600 pixelHeight"/>
-                  <v:f eqn="sum @0 0 1"/>
-                  <v:f eqn="prod @6 1 2"/>
-                  <v:f eqn="prod @7 21600 pixelWidth"/>
-                  <v:f eqn="sum @8 21600 0"/>
-                  <v:f eqn="prod @7 21600 pixelHeight"/>
-                  <v:f eqn="sum @10 21600 0"/>
-                </v:formulas>
-                <v:path o:extrusionok="f" gradientshapeok="t" o:connecttype="rect"/>
-                <o:lock v:ext="edit" aspectratio="t"/>
-              </v:shapetype>
-              <v:shape id="_x0000_i1" o:spid="_x0000_s1" type="#_x0000_t75" style="position:absolute;z-index:-251658240;o:allowoverlap:true;o:allowincell:true;mso-position-horizontal-relative:margin;margin-left:0.00pt;mso-position-horizontal:absolute;mso-position-vertical-relative:text;margin-top:12.23pt;mso-position-vertical:absolute;width:106.89pt;height:46.91pt;mso-wrap-distance-left:9.00pt;mso-wrap-distance-top:0.00pt;mso-wrap-distance-right:9.00pt;mso-wrap-distance-bottom:0.00pt;z-index:1;" wrapcoords="0 0 0 98926 99088 98926 99088 0 0 0" stroked="false">
-                <w10:wrap type="tight"/>
-                <v:imagedata r:id="rId9" o:title=""/>
-                <o:lock v:ext="edit" rotation="t"/>
-              </v:shape>
-            </w:pict>
-          </mc:Fallback>
-        </mc:AlternateContent>
       </w:r>
       <w:r>
         <w:rPr>
@@ -557,21 +471,74 @@
         </w:rPr>
       </w:pPr>
       <w:r>
-        <w:rPr>
-          <w:sz w:val="24"/>
-        </w:rPr>
-      </w:r>
-      <w:r>
-        <w:rPr>
-          <w:color w:val="555555"/>
-          <w:sz w:val="14"/>
-        </w:rPr>
-      </w:r>
-      <w:r>
-        <w:rPr>
-          <w:color w:val="555555"/>
-          <w:sz w:val="14"/>
-        </w:rPr>
+        <mc:AlternateContent>
+          <mc:Choice Requires="wpg">
+            <w:drawing>
+              <wp:inline distT="0" distB="0" distL="0" distR="0">
+                <wp:extent cx="1357525" cy="595705"/>
+                <wp:effectExtent l="0" t="0" r="0" b="0"/>
+                <wp:docPr id="2" name="Imagen 1"/>
+                <wp:cNvGraphicFramePr>
+                  <a:graphicFrameLocks noChangeAspect="1"/>
+                </wp:cNvGraphicFramePr>
+                <a:graphic>
+                  <a:graphicData uri="http://schemas.openxmlformats.org/drawingml/2006/picture">
+                    <pic:pic xmlns:pic="http://schemas.openxmlformats.org/drawingml/2006/picture">
+                      <pic:nvPicPr>
+                        <pic:cNvPr id="25143027" name=""/>
+                        <pic:cNvPicPr>
+                          <a:picLocks noChangeAspect="1"/>
+                        </pic:cNvPicPr>
+                        <pic:nvPr/>
+                      </pic:nvPicPr>
+                      <pic:blipFill rotWithShape="1">
+                        <a:blip r:embed="rId9"/>
+                        <a:stretch/>
+                      </pic:blipFill>
+                      <pic:spPr bwMode="auto">
+                        <a:xfrm flipH="0" flipV="0">
+                          <a:off x="0" y="0"/>
+                          <a:ext cx="1357525" cy="595705"/>
+                        </a:xfrm>
+                        <a:prstGeom prst="rect">
+                          <a:avLst/>
+                        </a:prstGeom>
+                      </pic:spPr>
+                    </pic:pic>
+                  </a:graphicData>
+                </a:graphic>
+              </wp:inline>
+            </w:drawing>
+          </mc:Choice>
+          <mc:Fallback>
+            <w:pict>
+              <v:shapetype id="_x0000_t75" coordsize="21600,21600" o:spt="75" o:preferrelative="t" path="m@4@5l@4@11@9@11@9@5xe" filled="f" stroked="f">
+                <v:stroke joinstyle="miter"/>
+                <v:formulas>
+                  <v:f eqn="if lineDrawn pixelLineWidth 0"/>
+                  <v:f eqn="sum @0 1 0"/>
+                  <v:f eqn="sum 0 0 @1"/>
+                  <v:f eqn="prod @2 1 2"/>
+                  <v:f eqn="prod @3 21600 pixelWidth"/>
+                  <v:f eqn="prod @3 21600 pixelHeight"/>
+                  <v:f eqn="sum @0 0 1"/>
+                  <v:f eqn="prod @6 1 2"/>
+                  <v:f eqn="prod @7 21600 pixelWidth"/>
+                  <v:f eqn="sum @8 21600 0"/>
+                  <v:f eqn="prod @7 21600 pixelHeight"/>
+                  <v:f eqn="sum @10 21600 0"/>
+                </v:formulas>
+                <v:path o:extrusionok="f" gradientshapeok="t" o:connecttype="rect"/>
+                <o:lock v:ext="edit" aspectratio="t"/>
+              </v:shapetype>
+              <v:shape id="_x0000_i1" o:spid="_x0000_s1" type="#_x0000_t75" style="position:absolute;z-index:-251658240;o:allowoverlap:true;o:allowincell:true;mso-position-horizontal-relative:margin;margin-left:0.00pt;mso-position-horizontal:absolute;mso-position-vertical-relative:text;margin-top:12.23pt;mso-position-vertical:absolute;width:106.89pt;height:46.91pt;mso-wrap-distance-left:9.00pt;mso-wrap-distance-top:0.00pt;mso-wrap-distance-right:9.00pt;mso-wrap-distance-bottom:0.00pt;z-index:1;" wrapcoords="0 0 0 98926 99088 98926 99088 0 0 0" stroked="false">
+                <w10:wrap type="tight"/>
+                <v:imagedata r:id="rId9" o:title=""/>
+                <o:lock v:ext="edit" rotation="t"/>
+              </v:shape>
+            </w:pict>
+          </mc:Fallback>
+        </mc:AlternateContent>
       </w:r>
     </w:p>
     <w:p>

</xml_diff>